<commit_message>
refactor: update search configuration, clean up project structure, and add environment and gitignore files.
</commit_message>
<xml_diff>
--- a/reports/Report_Comments.docx
+++ b/reports/Report_Comments.docx
@@ -35,7 +35,7 @@
         <w:pStyle w:val="Heading1"/>
       </w:pPr>
       <w:r>
-        <w:t>Opportunity Brief: comment_n2ycvjc</w:t>
+        <w:t>Opportunity Brief: comment_n540a85</w:t>
       </w:r>
     </w:p>
     <w:p>
@@ -46,7 +46,7 @@
         <w:t xml:space="preserve">Subreddit: </w:t>
       </w:r>
       <w:r>
-        <w:t xml:space="preserve">r/dating | </w:t>
+        <w:t xml:space="preserve">r/TooAfraidToAsk | </w:t>
       </w:r>
       <w:r>
         <w:rPr>
@@ -55,7 +55,7 @@
         <w:t xml:space="preserve">Date: </w:t>
       </w:r>
       <w:r>
-        <w:t>2025-07-14</w:t>
+        <w:t>2025-07-25</w:t>
       </w:r>
     </w:p>
     <w:p>
@@ -85,7 +85,7 @@
     </w:p>
     <w:p>
       <w:r>
-        <w:t>999.47</w:t>
+        <w:t>2141.98</w:t>
       </w:r>
     </w:p>
     <w:p>
@@ -104,7 +104,7 @@
         <w:t xml:space="preserve">Original Post Title: </w:t>
       </w:r>
       <w:r>
-        <w:t>Went on a date this Friday with this guy and I apparently ruined it when I gave him the ick over ice cream?</w:t>
+        <w:t>Why do women seem to be able to avoid catching feelings for their male friends than the other way around?</w:t>
         <w:br/>
         <w:br/>
       </w:r>
@@ -116,7 +116,7 @@
         <w:br/>
       </w:r>
       <w:r>
-        <w:t>I decided to give dating apps one more try but after Friday, I deleted them and I’m done for now. I, 31F agreed to go out for dinner with this guy, 33M and things were fine. He was a bit serious, not very engaging in the sense where he mostly talked about his work in accounting and his soccer hobby. Dinner was ok but then he said “This was nice, I don’t want it to end yet.” And me, I said “Oh there’s a salt and straw down the street. Do you want some and walk around?” He agreed but didn’t want any ice cream once we got to the counter. Fine, I’m not forcing someone to have anything, but as he’s talking and walking, the ice cream in my cone started to melt a bit and I dripped some on my shirt. I laughed it off a bit, saying oops and I got out my tide pen and cleaned it off. He was a bit miffed about it I felt and suddenly had to call it a night because he had an early morning, sure that’s fine. I go home and the next morning I see a message from him saying he doesn’t see us going further because he felt like I should be more mature for my age and that being messy is not cute?? Sure! No one wants to spill food on themselves on a first date but damn, tough crowd. I laugh it off because I didn’t think it was that serious but I guess that’s an ick for men now.</w:t>
+        <w:t>First of all I absolutely believe that men and women can be friends. I have 3 female friends currently, and I don't have feelings for any. There was one I did in the past, but in total I think that I had feelings for like 10% of my female friends, so it's far from the norm. Anyway... If you look at threads where someone caught feelings for their opposite sex friends, there's certainly from both sides, both from a male and female perspective. However, the guy catching feelings for their female friend is much MUCH more common, and you see so many threads where the woman responds with ""I didn't even know you looked at me that way!"". Why is it so much more common for women to avoid catching feelings? Casual sex and hooking up I guess, but when it comes to dating, relationship material where personality, matching with each other and such I don't quite understand.</w:t>
       </w:r>
     </w:p>
     <w:p>
@@ -125,11 +125,11 @@
           <w:b/>
         </w:rPr>
         <w:br/>
-        <w:t>Target Comment by u/BeingReasonable87:</w:t>
+        <w:t>Target Comment by u/shin_malphur13:</w:t>
         <w:br/>
       </w:r>
       <w:r>
-        <w:t>An immature person wouldn’t have a Tide pen in their purse ready to go.. also wtf some foods are just messy duh..he sounds like a prick.</w:t>
+        <w:t>Catching feelings is different from catching feelings, acting on it, and ending up breaking that friendship bc you leaned too far into shooting your shot</w:t>
       </w:r>
     </w:p>
     <w:p>
@@ -148,7 +148,7 @@
         <w:t xml:space="preserve">Theme: </w:t>
       </w:r>
       <w:r>
-        <w:t>Perceptions of Maturity on Dates</w:t>
+        <w:t>Balancing friendship and romantic interest</w:t>
         <w:br/>
       </w:r>
       <w:r>
@@ -158,7 +158,7 @@
         <w:t xml:space="preserve">Core Philosophy: </w:t>
       </w:r>
       <w:r>
-        <w:t>Inner Freedom Before External Skill</w:t>
+        <w:t>Emotional Honesty + Social Grace</w:t>
         <w:br/>
       </w:r>
       <w:r>
@@ -168,7 +168,7 @@
         <w:t xml:space="preserve">Strategic Direction: </w:t>
       </w:r>
       <w:r>
-        <w:t>Encourage a discussion on how self-awareness and inner confidence can redefine common perceptions of maturity and dating rituals.</w:t>
+        <w:t>Foster understanding of how to express and navigate feelings honestly without damaging friendships, emphasizing the importance of social nuance in friendships.</w:t>
       </w:r>
     </w:p>
     <w:p>
@@ -183,7 +183,7 @@
         <w:pStyle w:val="Heading1"/>
       </w:pPr>
       <w:r>
-        <w:t>Opportunity Brief: comment_n3hooio</w:t>
+        <w:t>Opportunity Brief: comment_n5408eb</w:t>
       </w:r>
     </w:p>
     <w:p>
@@ -203,7 +203,7 @@
         <w:t xml:space="preserve">Date: </w:t>
       </w:r>
       <w:r>
-        <w:t>2025-07-17</w:t>
+        <w:t>2025-07-25</w:t>
       </w:r>
     </w:p>
     <w:p>
@@ -213,7 +213,7 @@
         </w:rPr>
         <w:t xml:space="preserve">Link to content: </w:t>
       </w:r>
-      <w:hyperlink r:id="rId10">
+      <w:hyperlink r:id="rId9">
         <w:r>
           <w:rPr>
             <w:color w:val="0563C1"/>
@@ -233,7 +233,7 @@
     </w:p>
     <w:p>
       <w:r>
-        <w:t>3785.71</w:t>
+        <w:t>1039.98</w:t>
       </w:r>
     </w:p>
     <w:p>
@@ -252,7 +252,7 @@
         <w:t xml:space="preserve">Original Post Title: </w:t>
       </w:r>
       <w:r>
-        <w:t>what do i do if my gf is too attractive?</w:t>
+        <w:t>Why do women seem to be able to avoid catching feelings for their male friends than the other way around?</w:t>
         <w:br/>
         <w:br/>
       </w:r>
@@ -264,7 +264,7 @@
         <w:br/>
       </w:r>
       <w:r>
-        <w:t>my girlfriend is too attractive for me i genuinely dont know what she sees in me and it is scaring me, i feel she has way better options and i am so afraid she will leave although i know shes so loyal it just always spikes my mind. She makes other girls unattractive and im not even exaggerating, i just fear that thinking like this will make me overthink alot of things SO I NEED HELP!</w:t>
+        <w:t>First of all I absolutely believe that men and women can be friends. I have 3 female friends currently, and I don't have feelings for any. There was one I did in the past, but in total I think that I had feelings for like 10% of my female friends, so it's far from the norm. Anyway... If you look at threads where someone caught feelings for their opposite sex friends, there's certainly from both sides, both from a male and female perspective. However, the guy catching feelings for their female friend is much MUCH more common, and you see so many threads where the woman responds with ""I didn't even know you looked at me that way!"". Why is it so much more common for women to avoid catching feelings? Casual sex and hooking up I guess, but when it comes to dating, relationship material where personality, matching with each other and such I don't quite understand.</w:t>
       </w:r>
     </w:p>
     <w:p>
@@ -273,11 +273,11 @@
           <w:b/>
         </w:rPr>
         <w:br/>
-        <w:t>Target Comment by u/MajorTom813:</w:t>
+        <w:t>Target Comment by u/OrdinaryQuestions:</w:t>
         <w:br/>
       </w:r>
       <w:r>
-        <w:t>You don't get to decide who she dates. She does. And she chose you. Do your best for her and try to feel a little more secure about it.</w:t>
+        <w:t>There's a few discussions happening online about how many men don't even acknowledge the existence of a woman he doesn't find attractive. So what may be happening is he meets her and finds her on some level to be attractive. So theres already that little flame going for catching feelings. Befriend. And feelings confessed. Another reason is many guys are told that to find a partner its by making friends first. So they spend time with a female friend and start thinking about those things. Contemplating, developing a crush, and confess. Men are also more likely to hold the idea that men and women cant be friends. Where women think they can be. So women are happy to make friends and keep someone firmly in the friend section. Whereas if a man has these opinions, then theyre less likely to make many femsle friends. So that 1 woman gets all his focus, obsess, catch feelings. Growing statistically, women are also less likely to want a relationship. Finding theyre not worth it, that theyre unhappier, etc. Whereas men are happier in relationships and so are more actively seeking them. Thus resulting in more men catching and confessing feelings. Andddd theres how gender norms still set up that men pursue, shoe interest, ask out, etc. So a woman is more likely to keep a crush secret and hope he asks her = looks like more men catch feelings.</w:t>
       </w:r>
     </w:p>
     <w:p>
@@ -296,7 +296,7 @@
         <w:t xml:space="preserve">Theme: </w:t>
       </w:r>
       <w:r>
-        <w:t>Insecurity in Relationships</w:t>
+        <w:t>Cultural and personal narratives influencing friendship and romance</w:t>
         <w:br/>
       </w:r>
       <w:r>
@@ -316,7 +316,7 @@
         <w:t xml:space="preserve">Strategic Direction: </w:t>
       </w:r>
       <w:r>
-        <w:t>Explore how embracing vulnerability and open communication can strengthen relationship bonds and self-assurance.</w:t>
+        <w:t>Discuss the influence of societal expectations on male and female friendships and the evolving dynamics of how men and women perceive and pursue relationships.</w:t>
       </w:r>
     </w:p>
     <w:sectPr>

</xml_diff>